<commit_message>
Synopsis v2: wolf gift (blood, pack, howl, transformation), wolves of White Giorgi instead of Gmerti
Co-Authored-By: Claude Opus 5.5 <noreply@anthropic.com>
Claude-Session: https://claude.ai/code/session_01TUhCpmyEuwXm7rGtZgfP6r
</commit_message>
<xml_diff>
--- a/exports/07-tysyachelikiy-geroy.docx
+++ b/exports/07-tysyachelikiy-geroy.docx
@@ -9,6 +9,26 @@
       </w:pPr>
       <w:r>
         <w:t xml:space="preserve">«Тысячеликий герой» × Вахтанг Горгасали: единая вселенная и сюжет</w:t>
+      </w:r>
+    </w:p>
+    <w:p>
+      <w:pPr>
+        <w:pStyle w:val="BlockText"/>
+      </w:pPr>
+      <w:r>
+        <w:t xml:space="preserve">⚠️ Волки в этом документе — уже «волки Белого Георгия», а не Гмерти. Актуальная версия сюжета с волчьим даром:</w:t>
+      </w:r>
+      <w:r>
+        <w:t xml:space="preserve"> </w:t>
+      </w:r>
+      <w:r>
+        <w:rPr>
+          <w:rStyle w:val="VerbatimChar"/>
+        </w:rPr>
+        <w:t xml:space="preserve">08-sinopsis.md</w:t>
+      </w:r>
+      <w:r>
+        <w:t xml:space="preserve">.</w:t>
       </w:r>
     </w:p>
     <w:p>
@@ -1126,7 +1146,7 @@
                 <w:bCs/>
                 <w:b/>
               </w:rPr>
-              <w:t xml:space="preserve">божьи волки Гмерти</w:t>
+              <w:t xml:space="preserve">волки Белого Георгия Белого Георгия</w:t>
             </w:r>
             <w:r>
               <w:t xml:space="preserve"> </w:t>
@@ -1767,7 +1787,7 @@
           <w:bCs/>
           <w:b/>
         </w:rPr>
-        <w:t xml:space="preserve">божьи волки</w:t>
+        <w:t xml:space="preserve">волки Белого Георгия</w:t>
       </w:r>
       <w:r>
         <w:t xml:space="preserve">.</w:t>
@@ -2301,7 +2321,7 @@
           <w:bCs/>
           <w:b/>
         </w:rPr>
-        <w:t xml:space="preserve">божьи волки</w:t>
+        <w:t xml:space="preserve">волки Белого Георгия</w:t>
       </w:r>
       <w:r>
         <w:t xml:space="preserve">.</w:t>
@@ -2752,7 +2772,7 @@
               <w:jc w:val="left"/>
             </w:pPr>
             <w:r>
-              <w:t xml:space="preserve">Артаваз 📜; божьи волки; подчинённая али</w:t>
+              <w:t xml:space="preserve">Артаваз 📜; волки Белого Георгия; подчинённая али</w:t>
             </w:r>
           </w:p>
         </w:tc>

</xml_diff>